<commit_message>
Outline Q3 v1 fixed (mark fabricated beta estimates as TBD) + Outline Q4 v1 LPA built (Abstract + 4 sections Introduction + 5-step LPA strategy + 5-section Results + 6-section Discussion + 12 references); both songngu Anh-Viet, 48-method PASS
</commit_message>
<xml_diff>
--- a/bai-bao-Q1/Outline_Q3_IMRaD_SongNgu_v1_08062026.docx
+++ b/bai-bao-Q1/Outline_Q3_IMRaD_SongNgu_v1_08062026.docx
@@ -972,7 +972,7 @@
           <w:rFonts w:ascii="Times New Roman" w:hAnsi="Times New Roman"/>
           <w:sz w:val="22"/>
         </w:rPr>
-        <w:t>Focus on substantively interesting non-invariant pathways. Expected key finding: bullying → SAD β stronger in girls (preliminary β_girls = 0.45, β_boys = 0.30 estimate). Discuss effect size magnitude.</w:t>
+        <w:t>Focus on substantively interesting non-invariant pathways. Expected key finding (TO BE CONFIRMED by analysis — NOT a fabricated estimate): bullying → SAD β may be stronger in girls than boys, but exact β values await multi-group SEM computation. Discuss effect size magnitude in narrative form.</w:t>
       </w:r>
     </w:p>
     <w:p>
@@ -988,7 +988,7 @@
           <w:color w:val="333333"/>
           <w:sz w:val="22"/>
         </w:rPr>
-        <w:t>Tập trung vào các đường dẫn không bất biến có ý nghĩa thực chất. Phát hiện chính dự kiến: bắt nạt → SAD β mạnh hơn ở nữ (ước tính sơ bộ β_nữ = 0,45, β_nam = 0,30). Bàn luận về độ lớn effect size.</w:t>
+        <w:t>Tập trung vào các đường dẫn không bất biến có ý nghĩa thực chất. Phát hiện chính dự kiến (CHỜ XÁC NHẬN từ phân tích — KHÔNG phải ước tính bịa): đường dẫn bắt nạt → SAD có thể mạnh hơn ở nữ so với nam, nhưng giá trị β chính xác chờ kết quả tính toán SEM đa nhóm. Bàn luận độ lớn effect size qua mô tả ngôn từ.</w:t>
       </w:r>
     </w:p>
     <w:p>

</xml_diff>

<commit_message>
Q3+Q4 outlines deep recheck fixes: Q3 unify Eight validated scales / Tám thang đo (was mixed instruments+công cụ); Q4 cite previously orphan refs Hankin+McLean+Kessler+Jefferies trong 1.2 epidemiology context + add explicit Nylund 2007 citation near LMR-LRT in 2.3 Step 3 + add Rose+Hill-Lynch in new Section 4.3 co-rumination + renumber 4.3→4.4→4.5→4.6→4.7
</commit_message>
<xml_diff>
--- a/bai-bao-Q1/Outline_Q3_IMRaD_SongNgu_v1_08062026.docx
+++ b/bai-bao-Q1/Outline_Q3_IMRaD_SongNgu_v1_08062026.docx
@@ -173,7 +173,7 @@
           <w:rFonts w:ascii="Times New Roman" w:hAnsi="Times New Roman"/>
           <w:sz w:val="22"/>
         </w:rPr>
-        <w:t>Cross-sectional survey of 1,352 Vietnamese lower secondary students (614 boys, 738 girls; ages 11-14) from two purposively selected schools in Hanoi (Nhat Tan urban, Tay Mo suburban). Eight validated instruments measured three risk factors (bullying, academic stress, smartphone addiction), four protective factors (school membership, parental support, peer support, self-esteem), and three anxiety subtypes (GAD, SAD, SocAD). Multi-group SEM tested configural, metric, and scalar measurement invariance, then structural invariance of all 21 pathways, using ΔCFI ≤ 0.01 (Cheung &amp; Rensvold 2002) and ΔRMSEA ≤ 0.015.</w:t>
+        <w:t>Cross-sectional survey of 1,352 Vietnamese lower secondary students (614 boys, 738 girls; ages 11-14) from two purposively selected schools in Hanoi (Nhat Tan urban, Tay Mo suburban). Eight validated scales measured three risk factors (bullying, academic stress, smartphone addiction), four protective factors (school membership, parental support, peer support, self-esteem), and three anxiety subtypes (GAD, SAD, SocAD). Multi-group SEM tested configural, metric, and scalar measurement invariance, then structural invariance of all 21 pathways, using ΔCFI ≤ 0.01 (Cheung &amp; Rensvold 2002) and ΔRMSEA ≤ 0.015.</w:t>
       </w:r>
     </w:p>
     <w:p>
@@ -189,7 +189,7 @@
           <w:color w:val="333333"/>
           <w:sz w:val="22"/>
         </w:rPr>
-        <w:t>Khảo sát cắt ngang 1.352 học sinh THCS Việt Nam (614 nam, 738 nữ; 11-14 tuổi) từ hai trường được chọn có chủ đích tại Hà Nội (Nhật Tân — đô thị, Tây Mỗ — ngoại ô). Tám công cụ đã được chuẩn hóa đo ba yếu tố nguy cơ (bắt nạt, áp lực học tập, nghiện điện thoại), bốn yếu tố bảo vệ (gắn bó trường, hỗ trợ cha mẹ, hỗ trợ bạn bè, tự trọng), và ba phân loại lo âu (GAD, SAD, SocAD). SEM đa nhóm kiểm chứng bất biến đo lường ở cấp cấu hình, metric, scalar, sau đó kiểm chứng bất biến cấu trúc của toàn bộ 21 đường dẫn, sử dụng ΔCFI ≤ 0,01 (Cheung &amp; Rensvold 2002) và ΔRMSEA ≤ 0,015.</w:t>
+        <w:t>Khảo sát cắt ngang 1.352 học sinh THCS Việt Nam (614 nam, 738 nữ; 11-14 tuổi) từ hai trường được chọn có chủ đích tại Hà Nội (Nhật Tân — đô thị, Tây Mỗ — ngoại ô). Tám thang đo đã được chuẩn hóa đo ba yếu tố nguy cơ (bắt nạt, áp lực học tập, nghiện điện thoại), bốn yếu tố bảo vệ (gắn bó trường, hỗ trợ cha mẹ, hỗ trợ bạn bè, tự trọng), và ba phân loại lo âu (GAD, SAD, SocAD). SEM đa nhóm kiểm chứng bất biến đo lường ở cấp cấu hình, metric, scalar, sau đó kiểm chứng bất biến cấu trúc của toàn bộ 21 đường dẫn, sử dụng ΔCFI ≤ 0,01 (Cheung &amp; Rensvold 2002) và ΔRMSEA ≤ 0,015.</w:t>
       </w:r>
     </w:p>
     <w:p>

</xml_diff>